<commit_message>
Agregar al Project Repository el procedimiento 3.3 para realizar un commit.
El apartado queda después de la estrategia GitFlow e indica pull, status, add, commit, push y el Pull Request hacia develop.

Co-authored-by: César Neftalí Rodríguez Sifuentes <CesRod404@users.noreply.github.com>
</commit_message>
<xml_diff>
--- a/01_Gestion_Proyecto/ID_02_Project_Repository/Project_Repository.docx
+++ b/01_Gestion_Proyecto/ID_02_Project_Repository/Project_Repository.docx
@@ -5096,6 +5096,126 @@
           <w:rtl w:val="0"/>
         </w:rPr>
         <w:t xml:space="preserve">Ramas temporales creadas para desarrollar una funcionalidad o tarea aislada (ej. feature/importar-empleados). Una vez terminadas y probadas unitariamente, se integra a develop mediante un Pull Request revisado.</w:t>
+      </w:r>
+    </w:p>
+    <w:p>
+      <w:pPr>
+        <w:jc w:val="both"/>
+        <w:rPr/>
+      </w:pPr>
+      <w:r>
+        <w:rPr>
+          <w:b w:val="1"/>
+          <w:bCs w:val="1"/>
+          <w:rtl w:val="0"/>
+        </w:rPr>
+        <w:t xml:space="preserve">3.3 Procedimiento para realizar un commit</w:t>
+      </w:r>
+      <w:r>
+        <w:rPr>
+          <w:rtl w:val="0"/>
+        </w:rPr>
+        <w:t xml:space="preserve">: Cada cambio se registra en el orden siguiente. El integrante no publica directo en main; la integración a esa rama se hace con un Pull Request hacia develop.</w:t>
+      </w:r>
+    </w:p>
+    <w:p>
+      <w:pPr>
+        <w:jc w:val="both"/>
+        <w:rPr/>
+      </w:pPr>
+      <w:r>
+        <w:rPr>
+          <w:b w:val="1"/>
+          <w:bCs w:val="1"/>
+          <w:rtl w:val="0"/>
+        </w:rPr>
+        <w:t xml:space="preserve">git pull:</w:t>
+      </w:r>
+      <w:r>
+        <w:rPr>
+          <w:rtl w:val="0"/>
+        </w:rPr>
+        <w:t xml:space="preserve"> Antes de editar se ejecuta git pull para traer lo ya integrado, y el trabajo continúa en la rama de la tarea (feature/nombre-tarea). En este repositorio también se usan ramas feature_*, future-* y cursor/*.</w:t>
+      </w:r>
+    </w:p>
+    <w:p>
+      <w:pPr>
+        <w:jc w:val="both"/>
+        <w:rPr/>
+      </w:pPr>
+      <w:r>
+        <w:rPr>
+          <w:b w:val="1"/>
+          <w:bCs w:val="1"/>
+          <w:rtl w:val="0"/>
+        </w:rPr>
+        <w:t xml:space="preserve">git status y git add:</w:t>
+      </w:r>
+      <w:r>
+        <w:rPr>
+          <w:rtl w:val="0"/>
+        </w:rPr>
+        <w:t xml:space="preserve"> Con git status se revisa qué archivos cambiaron. Después, git add incorpora solo esos archivos. No se agregan .env, claves, node_modules ni la carpeta dist.</w:t>
+      </w:r>
+    </w:p>
+    <w:p>
+      <w:pPr>
+        <w:jc w:val="both"/>
+        <w:rPr/>
+      </w:pPr>
+      <w:r>
+        <w:rPr>
+          <w:b w:val="1"/>
+          <w:bCs w:val="1"/>
+          <w:rtl w:val="0"/>
+        </w:rPr>
+        <w:t xml:space="preserve">git commit:</w:t>
+      </w:r>
+      <w:r>
+        <w:rPr>
+          <w:rtl w:val="0"/>
+        </w:rPr>
+        <w:t xml:space="preserve"> Se confirma con git commit -m "tipo(ID-tarea): descripción". El tipo es feat, fix, docs, test o refactor. El identificador es el de la tarea en el tablero, por ejemplo US-IMP-03. Un mensaje válido es feat(US-IMP-03): Validar duplicados antes de confirmar la importación.</w:t>
+      </w:r>
+    </w:p>
+    <w:p>
+      <w:pPr>
+        <w:jc w:val="both"/>
+        <w:rPr/>
+      </w:pPr>
+      <w:r>
+        <w:rPr>
+          <w:b w:val="1"/>
+          <w:bCs w:val="1"/>
+          <w:rtl w:val="0"/>
+        </w:rPr>
+        <w:t xml:space="preserve">git push:</w:t>
+      </w:r>
+      <w:r>
+        <w:rPr>
+          <w:rtl w:val="0"/>
+        </w:rPr>
+        <w:t xml:space="preserve"> Se publica la rama de trabajo con git push origin &lt;rama&gt;.</w:t>
+      </w:r>
+    </w:p>
+    <w:p>
+      <w:pPr>
+        <w:jc w:val="both"/>
+        <w:rPr/>
+      </w:pPr>
+      <w:r>
+        <w:rPr>
+          <w:b w:val="1"/>
+          <w:bCs w:val="1"/>
+          <w:rtl w:val="0"/>
+        </w:rPr>
+        <w:t xml:space="preserve">Pull Request:</w:t>
+      </w:r>
+      <w:r>
+        <w:rPr>
+          <w:rtl w:val="0"/>
+        </w:rPr>
+        <w:t xml:space="preserve"> Terminada la prueba de la rama, se abre un Pull Request hacia develop. No se hacen push directos a main.</w:t>
       </w:r>
     </w:p>
     <w:p>

</xml_diff>